<commit_message>
Finalize published submission artifacts
</commit_message>
<xml_diff>
--- a/output/docx/Regulation_Navigator_Week_2_Submission.docx
+++ b/output/docx/Regulation_Navigator_Week_2_Submission.docx
@@ -18,9 +18,15 @@
     </w:p>
     <w:p>
       <w:pPr>
-        <w:pStyle w:val="Title"/>
+        <w:spacing w:before="0" w:after="60"/>
       </w:pPr>
       <w:r>
+        <w:rPr>
+          <w:rFonts w:ascii="Arial" w:hAnsi="Arial"/>
+          <w:b w:val="0"/>
+          <w:color w:val="1F2937"/>
+          <w:sz w:val="52"/>
+        </w:rPr>
         <w:t>Medical Device Software</w:t>
         <w:br/>
         <w:t>Regulatory Navigator</w:t>
@@ -382,7 +388,7 @@
               <w:rPr>
                 <w:sz w:val="19"/>
               </w:rPr>
-              <w:t>0.004s p50 · 0.005s p95 · target ≤5s</w:t>
+              <w:t>0.006s p50 · 0.008s p95 · target ≤5s</w:t>
             </w:r>
           </w:p>
         </w:tc>
@@ -2607,7 +2613,7 @@
               <w:rPr>
                 <w:sz w:val="19"/>
               </w:rPr>
-              <w:t>0.004s / 0.005s</w:t>
+              <w:t>0.006s / 0.008s</w:t>
             </w:r>
           </w:p>
         </w:tc>
@@ -2631,7 +2637,7 @@
               <w:rPr>
                 <w:sz w:val="19"/>
               </w:rPr>
-              <w:t>p95 target ≤5s; cold load ≈0.257s</w:t>
+              <w:t>p95 target ≤5s</w:t>
             </w:r>
           </w:p>
         </w:tc>
@@ -3170,6 +3176,61 @@
         <w:t>Reproduction and handoff</w:t>
       </w:r>
     </w:p>
+    <w:tbl>
+      <w:tblPr>
+        <w:tblW w:type="auto" w:w="0"/>
+        <w:tblLayout w:type="fixed"/>
+        <w:tblLook w:firstColumn="1" w:firstRow="1" w:lastColumn="0" w:lastRow="0" w:noHBand="0" w:noVBand="1" w:val="04A0"/>
+      </w:tblPr>
+      <w:tblGrid>
+        <w:gridCol w:w="9360"/>
+      </w:tblGrid>
+      <w:tr>
+        <w:trPr>
+          <w:cantSplit/>
+        </w:trPr>
+        <w:tc>
+          <w:tcPr>
+            <w:tcW w:type="dxa" w:w="9360"/>
+            <w:shd w:fill="E6F4F1"/>
+            <w:tcMar>
+              <w:top w:w="140" w:type="dxa"/>
+              <w:start w:w="160" w:type="dxa"/>
+              <w:bottom w:w="140" w:type="dxa"/>
+              <w:end w:w="160" w:type="dxa"/>
+            </w:tcMar>
+            <w:vAlign w:val="center"/>
+          </w:tcPr>
+          <w:p>
+            <w:pPr>
+              <w:spacing w:after="80"/>
+            </w:pPr>
+            <w:r>
+              <w:rPr>
+                <w:b/>
+                <w:color w:val="115E59"/>
+              </w:rPr>
+              <w:t>Published project</w:t>
+            </w:r>
+          </w:p>
+          <w:p>
+            <w:pPr>
+              <w:spacing w:after="0"/>
+            </w:pPr>
+            <w:r>
+              <w:t>Live application: https://medical-regulation-navigator.streamlit.app</w:t>
+              <w:br/>
+              <w:t>Public repository: https://github.com/sandipbthorat/regulation-navigator</w:t>
+            </w:r>
+          </w:p>
+        </w:tc>
+      </w:tr>
+    </w:tbl>
+    <w:p>
+      <w:pPr>
+        <w:spacing w:after="0"/>
+      </w:pPr>
+    </w:p>
     <w:p>
       <w:r>
         <w:t>Run the application and release checks from the project root:</w:t>
@@ -3269,7 +3330,15 @@
         <w:pStyle w:val="ListBullet"/>
       </w:pPr>
       <w:r>
-        <w:t>Repository contents ready for GitHub; publishing requires an authenticated destination and visibility choice.</w:t>
+        <w:t>Public repository: https://github.com/sandipbthorat/regulation-navigator</w:t>
+      </w:r>
+    </w:p>
+    <w:p>
+      <w:pPr>
+        <w:pStyle w:val="ListBullet"/>
+      </w:pPr>
+      <w:r>
+        <w:t>Public application: https://medical-regulation-navigator.streamlit.app</w:t>
       </w:r>
     </w:p>
     <w:p>

</xml_diff>